<commit_message>
docs(reports): mark item 7 level mismatch as resolved after safety fix
Section 5.3 of the research report now says the CORE vs intervention-level
mismatch for a lone item 7 response was fixed in main 963f0d7, and the
example display lines for cases D and E are refreshed from a code re-run.
Bumps the report cache version so browsers fetch the new files.

Co-Authored-By: Claude Opus 5.5 (1M context) <noreply@anthropic.com>
Claude-Session: https://claude.ai/code/session_01LQdjFC9fnMrr9xSyyZtwZF
</commit_message>
<xml_diff>
--- a/docs/reports/oy-rals-practice-guide-rev-20261026.docx
+++ b/docs/reports/oy-rals-practice-guide-rev-20261026.docx
@@ -6843,7 +6843,7 @@
           <w:i w:val="0"/>
           <w:lang w:val="ko-KR" w:eastAsia="ko-KR"/>
         </w:rPr>
-        <w:t xml:space="preserve">화면 표시: 개입 수준 관찰·예방 · 안전 확인 우선 · 해석지 첫 행동 “이번 주 안에 자해·죽음 관련 안전 신호의 현재 상황을 직접 안전 면담으로 확인합니다.”</w:t>
+        <w:t xml:space="preserve">화면 표시: 개입 수준 단기 개별지원 · 안전 확인 우선 · 해석지 첫 행동 “오늘 안에 자해·죽음 관련 안전 신호의 현재 상황을 직접 안전 면담으로 확인합니다.”</w:t>
       </w:r>
     </w:p>
     <w:p>
@@ -6899,7 +6899,7 @@
           <w:i w:val="0"/>
           <w:lang w:val="ko-KR" w:eastAsia="ko-KR"/>
         </w:rPr>
-        <w:t xml:space="preserve">화면 표시: 개입 수준 관찰·예방 · 안전 확인 미완료 · 해석지 첫 행동 “학생이 편하게 도움을 청할 사람과 다음 만남 날짜를 정합니다.”</w:t>
+        <w:t xml:space="preserve">화면 표시: 개입 수준 집중 사례관리 (다기관) · 안전 확인 미완료 · 해석지 첫 행동 “오늘 안에 강요·협박·착취의 현재 위험 여부를 확인해 추가확인을 마칩니다.”</w:t>
       </w:r>
     </w:p>
     <w:p>

</xml_diff>